<commit_message>
Sharpen framing in the no-interest follow-up email
Entfernt die "nicht umstimmen"-Formulierung, die implizit unterstellt,
es gaebe etwas umzustimmen. Ersetzt durch eine zukunftsgerichtete
Botschaft: was es fuer das Unternehmen bedeutet, wirklich gesehen zu
werden, sich am Markt optimal zu behaupten und mit Online-Marketing
und laufendem Geschaeft optimal aufgestellt zu sein. Gleicher Zusatz
vor dem Abschluss der Mail.

Co-Authored-By: Claude Sonnet 5 <noreply@anthropic.com>
Claude-Session: https://claude.ai/code/session_01DeqSdBatYE6t9FA6GS9TPf
</commit_message>
<xml_diff>
--- a/vertrieb/Recognize-You-Email-nach-Absage.docx
+++ b/vertrieb/Recognize-You-Email-nach-Absage.docx
@@ -119,7 +119,25 @@
           <w:i w:val="false"/>
           <w:iCs w:val="false"/>
         </w:rPr>
-        <w:t xml:space="preserve">danke, dass du dir Zeit für unser Gespräch genommen hast. Dass du gerade nicht in weitere hohe Ausgaben investieren willst, verstehe ich vollkommen. Ich melde mich hier auch nicht, um dich nochmal umzustimmen, sondern weil ich dir ein paar Dinge dalassen möchte, die dir vielleicht trotzdem weiterhelfen, unabhängig davon, ob wir irgendwann zusammenarbeiten.</w:t>
+        <w:t xml:space="preserve">danke, dass du dir Zeit für unser Gespräch genommen hast. Dass du gerade nicht in weitere hohe Ausgaben investieren willst, verstehe ich vollkommen. Trotzdem möchte ich dir mitgeben, was es für die Zukunft von </w:t>
+      </w:r>
+      <w:r>
+        <w:rPr>
+          <w:b/>
+          <w:bCs/>
+          <w:i w:val="false"/>
+          <w:iCs w:val="false"/>
+        </w:rPr>
+        <w:t xml:space="preserve">[Firma]</w:t>
+      </w:r>
+      <w:r>
+        <w:rPr>
+          <w:b w:val="false"/>
+          <w:bCs w:val="false"/>
+          <w:i w:val="false"/>
+          <w:iCs w:val="false"/>
+        </w:rPr>
+        <w:t xml:space="preserve"> bedeutet, wirklich gesehen zu werden: dich in der heutigen Zeit am Markt optimal zu behaupten, und mit deinem Online-Marketing sowie deinem laufenden Geschäft so aufgestellt zu sein, dass beides ineinandergreift statt nebeneinanderher zu laufen.</w:t>
       </w:r>
     </w:p>
     <w:p>
@@ -270,6 +288,38 @@
           <w:iCs w:val="false"/>
         </w:rPr>
         <w:t xml:space="preserve">Genau das meinte ich am Telefon: Deine aktuellen Umsatzprobleme und eine schwache Außendarstellung hängen möglicherweise direkter zusammen, als es auf den ersten Blick aussieht. Das ändert sich nicht von selbst, nur weil man gerade nicht investiert.</w:t>
+      </w:r>
+    </w:p>
+    <w:p>
+      <w:pPr>
+        <w:spacing w:after="200"/>
+      </w:pPr>
+      <w:r>
+        <w:rPr>
+          <w:b w:val="false"/>
+          <w:bCs w:val="false"/>
+          <w:i w:val="false"/>
+          <w:iCs w:val="false"/>
+        </w:rPr>
+        <w:t xml:space="preserve">Wer heute am Markt wirklich gesehen wird, sichert sich morgen die Kunden, die sonst beim Wettbewerb landen. Genau darum geht es mir bei </w:t>
+      </w:r>
+      <w:r>
+        <w:rPr>
+          <w:b/>
+          <w:bCs/>
+          <w:i w:val="false"/>
+          <w:iCs w:val="false"/>
+        </w:rPr>
+        <w:t xml:space="preserve">[Firma]</w:t>
+      </w:r>
+      <w:r>
+        <w:rPr>
+          <w:b w:val="false"/>
+          <w:bCs w:val="false"/>
+          <w:i w:val="false"/>
+          <w:iCs w:val="false"/>
+        </w:rPr>
+        <w:t xml:space="preserve">: dass dein Unternehmen so dasteht, wie die Arbeit dahinter es eigentlich verdient.</w:t>
       </w:r>
     </w:p>
     <w:p>

</xml_diff>

<commit_message>
Rewrite no-interest follow-up email with new tone and structure
Neue Betreffzeile "Was sich fuer dich aendert", Ueberschrift "Danke
fuer unser effizientes Gespraech" in der Mail selbst, geschriebenes
Du mit grossem D. Fuenf inhaltliche Bloecke wie vorgegeben: Ist-
Zustand, Gedankenmuster/ganzheitlicher Blick, Ziel, drei Fakten als
Ergebnis, Abschluss zur Unverwechselbarkeit des Kunden.

Co-Authored-By: Claude Sonnet 5 <noreply@anthropic.com>
Claude-Session: https://claude.ai/code/session_01DeqSdBatYE6t9FA6GS9TPf
</commit_message>
<xml_diff>
--- a/vertrieb/Recognize-You-Email-nach-Absage.docx
+++ b/vertrieb/Recognize-You-Email-nach-Absage.docx
@@ -8,7 +8,7 @@
         <w:spacing w:after="120"/>
       </w:pPr>
       <w:r>
-        <w:t xml:space="preserve">E-Mail-Vorlage bei echtem Desinteresse</w:t>
+        <w:t xml:space="preserve">E-Mail-Vorlage bei fehlendem Interesse</w:t>
       </w:r>
     </w:p>
     <w:p>
@@ -20,7 +20,7 @@
           <w:i/>
           <w:iCs/>
         </w:rPr>
-        <w:t xml:space="preserve">Für den Fall, dass ein Kunde in Call 2 ernsthaft und wiederholt abwinkt, zum Beispiel mit „Ich bin sowieso schon im Minus, ich will keine weiteren hohen Ausgaben“, nicht nur mit der kurzen Blockade aus dem Einwand „kein Budget wegen Umsatzproblemen“ in Call 2. Ziel ist, echten Mehrwert dazulassen und die Tür offen zu halten, ohne Druck.</w:t>
+        <w:t xml:space="preserve">Für den Fall, dass ein Kunde in Call 2 nicht direkt weitermachen möchte, zum Beispiel weil gerade kein Budget da ist, und der kurze Einwand aus Call 2 „kein Budget wegen Umsatzproblemen“ nicht reicht. Ziel ist, echten Mehrwert dazulassen und die Tür offen zu halten, ohne Druck.</w:t>
       </w:r>
     </w:p>
     <w:p>
@@ -32,6 +32,18 @@
           <w:i/>
           <w:iCs/>
         </w:rPr>
+        <w:t xml:space="preserve">Bewusst im geschriebenen Du mit großem D (Du, Dein, Dir, Dich), das ist im Brief- und Mail-Stil üblich und wirkt persönlicher als das kleine du am Telefon.</w:t>
+      </w:r>
+    </w:p>
+    <w:p>
+      <w:pPr>
+        <w:spacing w:after="200"/>
+      </w:pPr>
+      <w:r>
+        <w:rPr>
+          <w:i/>
+          <w:iCs/>
+        </w:rPr>
         <w:t xml:space="preserve">Eckige Klammern [ ] markieren Stellen, die pro Kunde individuell gefüllt werden.</w:t>
       </w:r>
     </w:p>
@@ -55,16 +67,7 @@
           <w:i w:val="false"/>
           <w:iCs w:val="false"/>
         </w:rPr>
-        <w:t xml:space="preserve">Kurz noch etwas für dich, </w:t>
-      </w:r>
-      <w:r>
-        <w:rPr>
-          <w:b/>
-          <w:bCs/>
-          <w:i w:val="false"/>
-          <w:iCs w:val="false"/>
-        </w:rPr>
-        <w:t xml:space="preserve">[Vorname]</w:t>
+        <w:t xml:space="preserve">Was sich für dich ändert</w:t>
       </w:r>
     </w:p>
     <w:p>
@@ -114,12 +117,40 @@
       </w:pPr>
       <w:r>
         <w:rPr>
-          <w:b w:val="false"/>
-          <w:bCs w:val="false"/>
-          <w:i w:val="false"/>
-          <w:iCs w:val="false"/>
-        </w:rPr>
-        <w:t xml:space="preserve">danke, dass du dir Zeit für unser Gespräch genommen hast. Dass du gerade nicht in weitere hohe Ausgaben investieren willst, verstehe ich vollkommen. Trotzdem möchte ich dir mitgeben, was es für die Zukunft von </w:t>
+          <w:b/>
+          <w:bCs/>
+          <w:i w:val="false"/>
+          <w:iCs w:val="false"/>
+        </w:rPr>
+        <w:t xml:space="preserve">Danke für unser effizientes Gespräch</w:t>
+      </w:r>
+    </w:p>
+    <w:p>
+      <w:pPr>
+        <w:spacing w:after="200"/>
+      </w:pPr>
+      <w:r>
+        <w:rPr>
+          <w:b w:val="false"/>
+          <w:bCs w:val="false"/>
+          <w:i w:val="false"/>
+          <w:iCs w:val="false"/>
+        </w:rPr>
+        <w:t xml:space="preserve">Schön, dass wir uns über Dein Geschäft austauschen konnten.</w:t>
+      </w:r>
+    </w:p>
+    <w:p>
+      <w:pPr>
+        <w:spacing w:after="200"/>
+      </w:pPr>
+      <w:r>
+        <w:rPr>
+          <w:b w:val="false"/>
+          <w:bCs w:val="false"/>
+          <w:i w:val="false"/>
+          <w:iCs w:val="false"/>
+        </w:rPr>
+        <w:t xml:space="preserve">Aktuell wird </w:t>
       </w:r>
       <w:r>
         <w:rPr>
@@ -137,21 +168,139 @@
           <w:i w:val="false"/>
           <w:iCs w:val="false"/>
         </w:rPr>
-        <w:t xml:space="preserve"> bedeutet, wirklich gesehen zu werden: dich in der heutigen Zeit am Markt optimal zu behaupten, und mit deinem Online-Marketing sowie deinem laufenden Geschäft so aufgestellt zu sein, dass beides ineinandergreift statt nebeneinanderher zu laufen.</w:t>
-      </w:r>
-    </w:p>
-    <w:p>
-      <w:pPr>
-        <w:spacing w:after="200"/>
-      </w:pPr>
-      <w:r>
-        <w:rPr>
-          <w:b w:val="false"/>
-          <w:bCs w:val="false"/>
-          <w:i w:val="false"/>
-          <w:iCs w:val="false"/>
-        </w:rPr>
-        <w:t xml:space="preserve">Was mir bei deiner Seite konkret aufgefallen ist:</w:t>
+        <w:t xml:space="preserve"> online nicht annähernd so gesehen, wie es sich in Wahrheit am Markt behauptet. Mir ist zum Beispiel aufgefallen, dass </w:t>
+      </w:r>
+      <w:r>
+        <w:rPr>
+          <w:b/>
+          <w:bCs/>
+          <w:i w:val="false"/>
+          <w:iCs w:val="false"/>
+        </w:rPr>
+        <w:t xml:space="preserve">[Konkreter Punkt 1, zum Beispiel: keine mobile Version, die Seite lässt sich auf dem Handy kaum bedienen]</w:t>
+      </w:r>
+      <w:r>
+        <w:rPr>
+          <w:b w:val="false"/>
+          <w:bCs w:val="false"/>
+          <w:i w:val="false"/>
+          <w:iCs w:val="false"/>
+        </w:rPr>
+        <w:t xml:space="preserve">. Dazu kommt, dass </w:t>
+      </w:r>
+      <w:r>
+        <w:rPr>
+          <w:b/>
+          <w:bCs/>
+          <w:i w:val="false"/>
+          <w:iCs w:val="false"/>
+        </w:rPr>
+        <w:t xml:space="preserve">[Konkreter Punkt 2, zum Beispiel: kein klarer erster Satz, der zeigt, was Du eigentlich anbietest]</w:t>
+      </w:r>
+      <w:r>
+        <w:rPr>
+          <w:b w:val="false"/>
+          <w:bCs w:val="false"/>
+          <w:i w:val="false"/>
+          <w:iCs w:val="false"/>
+        </w:rPr>
+        <w:t xml:space="preserve">, und </w:t>
+      </w:r>
+      <w:r>
+        <w:rPr>
+          <w:b/>
+          <w:bCs/>
+          <w:i w:val="false"/>
+          <w:iCs w:val="false"/>
+        </w:rPr>
+        <w:t xml:space="preserve">[Konkreter Punkt 3, zum Beispiel: keine unkomplizierte Möglichkeit, Dich direkt zu kontaktieren]</w:t>
+      </w:r>
+      <w:r>
+        <w:rPr>
+          <w:b w:val="false"/>
+          <w:bCs w:val="false"/>
+          <w:i w:val="false"/>
+          <w:iCs w:val="false"/>
+        </w:rPr>
+        <w:t xml:space="preserve">. Das hat nichts mit der Qualität Deiner Arbeit zu tun, sondern nur damit, wie diese Qualität aktuell nach außen sichtbar wird, oder eben nicht.</w:t>
+      </w:r>
+    </w:p>
+    <w:p>
+      <w:pPr>
+        <w:spacing w:after="200"/>
+      </w:pPr>
+      <w:r>
+        <w:rPr>
+          <w:b w:val="false"/>
+          <w:bCs w:val="false"/>
+          <w:i w:val="false"/>
+          <w:iCs w:val="false"/>
+        </w:rPr>
+        <w:t xml:space="preserve">Bei den meisten Unternehmen entstehen Website, Social Media und Anzeigen getrennt voneinander, mal selbst gemacht, mal von unterschiedlichen Dienstleistern, ohne dass am Ende ein stimmiges Bild entsteht. Bei einer Marke, die wirklich funktioniert, ist das anders: Dort ist jeder Klick, jede Seite und jede Anzeige exakt auf das abgestimmt, was Deine eigene Stammkundschaft wirklich braucht. Genau dieser ganzheitliche Blick fehlt den meisten, die sich mit einzelnen Maßnahmen begnügen, und das ist der eigentliche Grund, warum dieser Bereich so oft liegen bleibt.</w:t>
+      </w:r>
+    </w:p>
+    <w:p>
+      <w:pPr>
+        <w:spacing w:after="200"/>
+      </w:pPr>
+      <w:r>
+        <w:rPr>
+          <w:b w:val="false"/>
+          <w:bCs w:val="false"/>
+          <w:i w:val="false"/>
+          <w:iCs w:val="false"/>
+        </w:rPr>
+        <w:t xml:space="preserve">Das Ziel ist einfach zu benennen: Du sollst mit </w:t>
+      </w:r>
+      <w:r>
+        <w:rPr>
+          <w:b/>
+          <w:bCs/>
+          <w:i w:val="false"/>
+          <w:iCs w:val="false"/>
+        </w:rPr>
+        <w:t xml:space="preserve">[Firma]</w:t>
+      </w:r>
+      <w:r>
+        <w:rPr>
+          <w:b w:val="false"/>
+          <w:bCs w:val="false"/>
+          <w:i w:val="false"/>
+          <w:iCs w:val="false"/>
+        </w:rPr>
+        <w:t xml:space="preserve"> am Markt so gesehen werden, dass die Menschen, die Du erreichen willst, auf den ersten Blick erkennen, wie gut Deine Arbeit tatsächlich ist.</w:t>
+      </w:r>
+    </w:p>
+    <w:p>
+      <w:pPr>
+        <w:spacing w:after="200"/>
+      </w:pPr>
+      <w:r>
+        <w:rPr>
+          <w:b w:val="false"/>
+          <w:bCs w:val="false"/>
+          <w:i w:val="false"/>
+          <w:iCs w:val="false"/>
+        </w:rPr>
+        <w:t xml:space="preserve">Drei Tatsachen zeigen, was passiert, sobald </w:t>
+      </w:r>
+      <w:r>
+        <w:rPr>
+          <w:b/>
+          <w:bCs/>
+          <w:i w:val="false"/>
+          <w:iCs w:val="false"/>
+        </w:rPr>
+        <w:t xml:space="preserve">[Firma]</w:t>
+      </w:r>
+      <w:r>
+        <w:rPr>
+          <w:b w:val="false"/>
+          <w:bCs w:val="false"/>
+          <w:i w:val="false"/>
+          <w:iCs w:val="false"/>
+        </w:rPr>
+        <w:t xml:space="preserve"> ordentlich dargestellt und gefunden wird:</w:t>
       </w:r>
     </w:p>
     <w:p>
@@ -164,12 +313,12 @@
       </w:r>
       <w:r>
         <w:rPr>
-          <w:b/>
-          <w:bCs/>
-          <w:i w:val="false"/>
-          <w:iCs w:val="false"/>
-        </w:rPr>
-        <w:t xml:space="preserve">[Konkreter Punkt 1, zum Beispiel: keine mobile Version, die Seite lässt sich auf dem Handy kaum bedienen]</w:t>
+          <w:b w:val="false"/>
+          <w:bCs w:val="false"/>
+          <w:i w:val="false"/>
+          <w:iCs w:val="false"/>
+        </w:rPr>
+        <w:t xml:space="preserve">Der erste Eindruck einer Website entsteht in etwa 50 Millisekunden, und rund 94 Prozent davon hängen allein am Design. Wer hier überzeugt, gewinnt den Vorsprung, bevor der erste Satz überhaupt gelesen wird.</w:t>
       </w:r>
     </w:p>
     <w:p>
@@ -182,12 +331,12 @@
       </w:r>
       <w:r>
         <w:rPr>
-          <w:b/>
-          <w:bCs/>
-          <w:i w:val="false"/>
-          <w:iCs w:val="false"/>
-        </w:rPr>
-        <w:t xml:space="preserve">[Konkreter Punkt 2, zum Beispiel: kein klarer erster Satz, der zeigt, was du eigentlich anbietest]</w:t>
+          <w:b w:val="false"/>
+          <w:bCs w:val="false"/>
+          <w:i w:val="false"/>
+          <w:iCs w:val="false"/>
+        </w:rPr>
+        <w:t xml:space="preserve">Rund 80 Prozent der Geschäftskunden informieren sich heute online über ein Unternehmen, bevor sie überhaupt zum Telefon greifen. Wer online überzeugt, wird angerufen, wer nicht überzeugt, erfährt es nie.</w:t>
       </w:r>
     </w:p>
     <w:p>
@@ -200,26 +349,151 @@
       </w:r>
       <w:r>
         <w:rPr>
-          <w:b/>
-          <w:bCs/>
-          <w:i w:val="false"/>
-          <w:iCs w:val="false"/>
-        </w:rPr>
-        <w:t xml:space="preserve">[Konkreter Punkt 3, zum Beispiel: keine unkomplizierte Möglichkeit, dich direkt zu kontaktieren]</w:t>
-      </w:r>
-    </w:p>
-    <w:p>
-      <w:pPr>
-        <w:spacing w:after="200"/>
-      </w:pPr>
-      <w:r>
-        <w:rPr>
-          <w:b w:val="false"/>
-          <w:bCs w:val="false"/>
-          <w:i w:val="false"/>
-          <w:iCs w:val="false"/>
-        </w:rPr>
-        <w:t xml:space="preserve">Das sind keine Kleinigkeiten, auch wenn sie oft so behandelt werden. Ein paar Zahlen dazu, die ich dir nicht vorenthalten will:</w:t>
+          <w:b w:val="false"/>
+          <w:bCs w:val="false"/>
+          <w:i w:val="false"/>
+          <w:iCs w:val="false"/>
+        </w:rPr>
+        <w:t xml:space="preserve">Im Schnitt hat ein Kunde schon etwa die Hälfte seiner Entscheidung getroffen, bevor er das erste Mal mit einem Vertrieb spricht. Ein starker Auftritt entscheidet also längst mit, bevor überhaupt ein Gespräch stattfindet.</w:t>
+      </w:r>
+    </w:p>
+    <w:p>
+      <w:pPr>
+        <w:spacing w:after="200"/>
+      </w:pPr>
+      <w:r>
+        <w:rPr>
+          <w:b/>
+          <w:bCs/>
+          <w:i w:val="false"/>
+          <w:iCs w:val="false"/>
+        </w:rPr>
+        <w:t xml:space="preserve">[Was das Unternehmen unverwechselbar und unwiderstehlich relevant macht, zum Beispiel eine bestimmte Erfahrung, Haltung oder Arbeitsweise]</w:t>
+      </w:r>
+      <w:r>
+        <w:rPr>
+          <w:b w:val="false"/>
+          <w:bCs w:val="false"/>
+          <w:i w:val="false"/>
+          <w:iCs w:val="false"/>
+        </w:rPr>
+        <w:t xml:space="preserve"> macht </w:t>
+      </w:r>
+      <w:r>
+        <w:rPr>
+          <w:b/>
+          <w:bCs/>
+          <w:i w:val="false"/>
+          <w:iCs w:val="false"/>
+        </w:rPr>
+        <w:t xml:space="preserve">[Firma]</w:t>
+      </w:r>
+      <w:r>
+        <w:rPr>
+          <w:b w:val="false"/>
+          <w:bCs w:val="false"/>
+          <w:i w:val="false"/>
+          <w:iCs w:val="false"/>
+        </w:rPr>
+        <w:t xml:space="preserve"> zu dem, was es ist. Genau das geht in der aktuellen Darstellung unter. Ein richtiger, ganzheitlicher Auftritt macht das nicht länger nur intern sichtbar, sondern für jeden auf den ersten Blick unmissverständlich klar.</w:t>
+      </w:r>
+    </w:p>
+    <w:p>
+      <w:pPr>
+        <w:spacing w:after="200"/>
+      </w:pPr>
+      <w:r>
+        <w:rPr>
+          <w:b w:val="false"/>
+          <w:bCs w:val="false"/>
+          <w:i w:val="false"/>
+          <w:iCs w:val="false"/>
+        </w:rPr>
+        <w:t xml:space="preserve">Viele Grüße</w:t>
+      </w:r>
+    </w:p>
+    <w:p>
+      <w:pPr>
+        <w:spacing w:after="200"/>
+      </w:pPr>
+      <w:r>
+        <w:rPr>
+          <w:b w:val="false"/>
+          <w:bCs w:val="false"/>
+          <w:i w:val="false"/>
+          <w:iCs w:val="false"/>
+        </w:rPr>
+        <w:t xml:space="preserve">Kevin</w:t>
+      </w:r>
+    </w:p>
+    <w:p>
+      <w:pPr>
+        <w:spacing w:after="200"/>
+      </w:pPr>
+    </w:p>
+    <w:p>
+      <w:pPr>
+        <w:spacing w:after="200"/>
+      </w:pPr>
+      <w:r>
+        <w:rPr>
+          <w:b w:val="false"/>
+          <w:bCs w:val="false"/>
+          <w:i w:val="false"/>
+          <w:iCs w:val="false"/>
+        </w:rPr>
+        <w:t xml:space="preserve">Kevin Kowsky</w:t>
+      </w:r>
+    </w:p>
+    <w:p>
+      <w:pPr>
+        <w:spacing w:after="200"/>
+      </w:pPr>
+      <w:r>
+        <w:rPr>
+          <w:b w:val="false"/>
+          <w:bCs w:val="false"/>
+          <w:i w:val="false"/>
+          <w:iCs w:val="false"/>
+        </w:rPr>
+        <w:t xml:space="preserve">Recognize You</w:t>
+      </w:r>
+    </w:p>
+    <w:p>
+      <w:pPr>
+        <w:spacing w:after="200"/>
+      </w:pPr>
+      <w:r>
+        <w:rPr>
+          <w:b w:val="false"/>
+          <w:bCs w:val="false"/>
+          <w:i w:val="false"/>
+          <w:iCs w:val="false"/>
+        </w:rPr>
+        <w:t xml:space="preserve">business@recognize-media.com</w:t>
+      </w:r>
+    </w:p>
+    <w:p>
+      <w:pPr>
+        <w:spacing w:after="200"/>
+      </w:pPr>
+      <w:r>
+        <w:rPr>
+          <w:b w:val="false"/>
+          <w:bCs w:val="false"/>
+          <w:i w:val="false"/>
+          <w:iCs w:val="false"/>
+        </w:rPr>
+        <w:t xml:space="preserve">0176 34653744</w:t>
+      </w:r>
+    </w:p>
+    <w:p>
+      <w:pPr>
+        <w:pStyle w:val="Heading2"/>
+        <w:spacing w:after="120" w:before="280"/>
+      </w:pPr>
+      <w:r>
+        <w:t xml:space="preserve">Fakten-Quellen (nicht Teil der Mail, nur zur Absicherung)</w:t>
       </w:r>
     </w:p>
     <w:p>
@@ -237,7 +511,7 @@
           <w:i w:val="false"/>
           <w:iCs w:val="false"/>
         </w:rPr>
-        <w:t xml:space="preserve">Der erste Eindruck einer Website entsteht in etwa 50 Millisekunden, und rund 94 Prozent davon hängen allein am Design. Bevor jemand liest, was du anbietest, hat er sich längst eine Meinung gebildet.</w:t>
+        <w:t xml:space="preserve">50 Millisekunden für den ersten Eindruck, rund 94 Prozent davon designbasiert: Lindgaard et al. (2006), bestätigt unter anderem durch die Stanford Web Credibility Research.</w:t>
       </w:r>
     </w:p>
     <w:p>
@@ -255,7 +529,7 @@
           <w:i w:val="false"/>
           <w:iCs w:val="false"/>
         </w:rPr>
-        <w:t xml:space="preserve">Rund 80 Prozent der Geschäftskunden informieren sich heute online über ein Unternehmen, bevor sie überhaupt zum Telefon greifen. Wer da nicht überzeugt, wird oft gar nicht erst angerufen, ohne dass du je davon erfährst.</w:t>
+        <w:t xml:space="preserve">Rund 80 Prozent der B2B-Kunden recherchieren online vor dem ersten Kontakt: unter anderem ECC Köln in Kooperation mit Hybris/Adobe.</w:t>
       </w:r>
     </w:p>
     <w:p>
@@ -273,174 +547,7 @@
           <w:i w:val="false"/>
           <w:iCs w:val="false"/>
         </w:rPr>
-        <w:t xml:space="preserve">Im Schnitt hat ein Kunde schon etwa die Hälfte seiner Entscheidung getroffen, bevor er das erste Mal mit einem Vertrieb spricht. Deine Seite entscheidet also oft mit, noch bevor überhaupt ein Gespräch stattfindet.</w:t>
-      </w:r>
-    </w:p>
-    <w:p>
-      <w:pPr>
-        <w:spacing w:after="200"/>
-      </w:pPr>
-      <w:r>
-        <w:rPr>
-          <w:b w:val="false"/>
-          <w:bCs w:val="false"/>
-          <w:i w:val="false"/>
-          <w:iCs w:val="false"/>
-        </w:rPr>
-        <w:t xml:space="preserve">Genau das meinte ich am Telefon: Deine aktuellen Umsatzprobleme und eine schwache Außendarstellung hängen möglicherweise direkter zusammen, als es auf den ersten Blick aussieht. Das ändert sich nicht von selbst, nur weil man gerade nicht investiert.</w:t>
-      </w:r>
-    </w:p>
-    <w:p>
-      <w:pPr>
-        <w:spacing w:after="200"/>
-      </w:pPr>
-      <w:r>
-        <w:rPr>
-          <w:b w:val="false"/>
-          <w:bCs w:val="false"/>
-          <w:i w:val="false"/>
-          <w:iCs w:val="false"/>
-        </w:rPr>
-        <w:t xml:space="preserve">Wer heute am Markt wirklich gesehen wird, sichert sich morgen die Kunden, die sonst beim Wettbewerb landen. Genau darum geht es mir bei </w:t>
-      </w:r>
-      <w:r>
-        <w:rPr>
-          <w:b/>
-          <w:bCs/>
-          <w:i w:val="false"/>
-          <w:iCs w:val="false"/>
-        </w:rPr>
-        <w:t xml:space="preserve">[Firma]</w:t>
-      </w:r>
-      <w:r>
-        <w:rPr>
-          <w:b w:val="false"/>
-          <w:bCs w:val="false"/>
-          <w:i w:val="false"/>
-          <w:iCs w:val="false"/>
-        </w:rPr>
-        <w:t xml:space="preserve">: dass dein Unternehmen so dasteht, wie die Arbeit dahinter es eigentlich verdient.</w:t>
-      </w:r>
-    </w:p>
-    <w:p>
-      <w:pPr>
-        <w:spacing w:after="200"/>
-      </w:pPr>
-      <w:r>
-        <w:rPr>
-          <w:b w:val="false"/>
-          <w:bCs w:val="false"/>
-          <w:i w:val="false"/>
-          <w:iCs w:val="false"/>
-        </w:rPr>
-        <w:t xml:space="preserve">Ich lass das jetzt einfach mal so stehen. Wenn sich bei dir was ändert oder du nochmal reden willst, meld dich einfach, die Tür bleibt offen. Und falls nicht: alles Gute für </w:t>
-      </w:r>
-      <w:r>
-        <w:rPr>
-          <w:b/>
-          <w:bCs/>
-          <w:i w:val="false"/>
-          <w:iCs w:val="false"/>
-        </w:rPr>
-        <w:t xml:space="preserve">[Firma]</w:t>
-      </w:r>
-      <w:r>
-        <w:rPr>
-          <w:b w:val="false"/>
-          <w:bCs w:val="false"/>
-          <w:i w:val="false"/>
-          <w:iCs w:val="false"/>
-        </w:rPr>
-        <w:t xml:space="preserve">.</w:t>
-      </w:r>
-    </w:p>
-    <w:p>
-      <w:pPr>
-        <w:spacing w:after="200"/>
-      </w:pPr>
-      <w:r>
-        <w:rPr>
-          <w:b w:val="false"/>
-          <w:bCs w:val="false"/>
-          <w:i w:val="false"/>
-          <w:iCs w:val="false"/>
-        </w:rPr>
-        <w:t xml:space="preserve">Viele Grüße</w:t>
-      </w:r>
-    </w:p>
-    <w:p>
-      <w:pPr>
-        <w:spacing w:after="200"/>
-      </w:pPr>
-      <w:r>
-        <w:rPr>
-          <w:b w:val="false"/>
-          <w:bCs w:val="false"/>
-          <w:i w:val="false"/>
-          <w:iCs w:val="false"/>
-        </w:rPr>
-        <w:t xml:space="preserve">Kevin</w:t>
-      </w:r>
-    </w:p>
-    <w:p>
-      <w:pPr>
-        <w:spacing w:after="200"/>
-      </w:pPr>
-    </w:p>
-    <w:p>
-      <w:pPr>
-        <w:spacing w:after="200"/>
-      </w:pPr>
-      <w:r>
-        <w:rPr>
-          <w:b w:val="false"/>
-          <w:bCs w:val="false"/>
-          <w:i w:val="false"/>
-          <w:iCs w:val="false"/>
-        </w:rPr>
-        <w:t xml:space="preserve">Kevin Kowsky</w:t>
-      </w:r>
-    </w:p>
-    <w:p>
-      <w:pPr>
-        <w:spacing w:after="200"/>
-      </w:pPr>
-      <w:r>
-        <w:rPr>
-          <w:b w:val="false"/>
-          <w:bCs w:val="false"/>
-          <w:i w:val="false"/>
-          <w:iCs w:val="false"/>
-        </w:rPr>
-        <w:t xml:space="preserve">Recognize You</w:t>
-      </w:r>
-    </w:p>
-    <w:p>
-      <w:pPr>
-        <w:spacing w:after="200"/>
-      </w:pPr>
-      <w:r>
-        <w:rPr>
-          <w:b w:val="false"/>
-          <w:bCs w:val="false"/>
-          <w:i w:val="false"/>
-          <w:iCs w:val="false"/>
-        </w:rPr>
-        <w:t xml:space="preserve">business@recognize-media.com</w:t>
-      </w:r>
-    </w:p>
-    <w:p>
-      <w:pPr>
-        <w:spacing w:after="200"/>
-      </w:pPr>
-      <w:r>
-        <w:rPr>
-          <w:b w:val="false"/>
-          <w:bCs w:val="false"/>
-          <w:i w:val="false"/>
-          <w:iCs w:val="false"/>
-        </w:rPr>
-        <w:t xml:space="preserve">0176 34653744</w:t>
+        <w:t xml:space="preserve">Rund die Hälfte der Kaufentscheidung ist im Schnitt vor dem ersten Vertriebskontakt bereits getroffen: vielzitierte B2B-Studien, unter anderem von Google/Millward Brown Digital in Verbindung mit CEB.</w:t>
       </w:r>
     </w:p>
     <w:p>
@@ -449,7 +556,7 @@
         <w:spacing w:after="120" w:before="280"/>
       </w:pPr>
       <w:r>
-        <w:t xml:space="preserve">Fakten-Quellen (nicht Teil der Mail, nur zur Absicherung)</w:t>
+        <w:t xml:space="preserve">Platzhalter-Legende</w:t>
       </w:r>
     </w:p>
     <w:p>
@@ -462,12 +569,21 @@
       </w:r>
       <w:r>
         <w:rPr>
-          <w:b w:val="false"/>
-          <w:bCs w:val="false"/>
-          <w:i w:val="false"/>
-          <w:iCs w:val="false"/>
-        </w:rPr>
-        <w:t xml:space="preserve">50 Millisekunden für den ersten Eindruck, rund 94 Prozent davon designbasiert: Lindgaard et al. (2006), bestätigt unter anderem durch die Stanford Web Credibility Research.</w:t>
+          <w:b/>
+          <w:bCs/>
+          <w:i w:val="false"/>
+          <w:iCs w:val="false"/>
+        </w:rPr>
+        <w:t xml:space="preserve">[Vorname]</w:t>
+      </w:r>
+      <w:r>
+        <w:rPr>
+          <w:b w:val="false"/>
+          <w:bCs w:val="false"/>
+          <w:i w:val="false"/>
+          <w:iCs w:val="false"/>
+        </w:rPr>
+        <w:t xml:space="preserve">: Vorname des Kunden, siehe Du-Regelung in den Telefonskripten.</w:t>
       </w:r>
     </w:p>
     <w:p>
@@ -480,12 +596,21 @@
       </w:r>
       <w:r>
         <w:rPr>
-          <w:b w:val="false"/>
-          <w:bCs w:val="false"/>
-          <w:i w:val="false"/>
-          <w:iCs w:val="false"/>
-        </w:rPr>
-        <w:t xml:space="preserve">Rund 80 Prozent der B2B-Kunden recherchieren online vor dem ersten Kontakt: unter anderem ECC Köln in Kooperation mit Hybris/Adobe.</w:t>
+          <w:b/>
+          <w:bCs/>
+          <w:i w:val="false"/>
+          <w:iCs w:val="false"/>
+        </w:rPr>
+        <w:t xml:space="preserve">[Firma]</w:t>
+      </w:r>
+      <w:r>
+        <w:rPr>
+          <w:b w:val="false"/>
+          <w:bCs w:val="false"/>
+          <w:i w:val="false"/>
+          <w:iCs w:val="false"/>
+        </w:rPr>
+        <w:t xml:space="preserve">: Name des Unternehmens des Kunden.</w:t>
       </w:r>
     </w:p>
     <w:p>
@@ -498,21 +623,21 @@
       </w:r>
       <w:r>
         <w:rPr>
-          <w:b w:val="false"/>
-          <w:bCs w:val="false"/>
-          <w:i w:val="false"/>
-          <w:iCs w:val="false"/>
-        </w:rPr>
-        <w:t xml:space="preserve">Rund die Hälfte der Kaufentscheidung ist im Schnitt vor dem ersten Vertriebskontakt bereits getroffen: vielzitierte B2B-Studien, unter anderem von Google/Millward Brown Digital in Verbindung mit CEB.</w:t>
-      </w:r>
-    </w:p>
-    <w:p>
-      <w:pPr>
-        <w:pStyle w:val="Heading2"/>
-        <w:spacing w:after="120" w:before="280"/>
-      </w:pPr>
-      <w:r>
-        <w:t xml:space="preserve">Platzhalter-Legende</w:t>
+          <w:b/>
+          <w:bCs/>
+          <w:i w:val="false"/>
+          <w:iCs w:val="false"/>
+        </w:rPr>
+        <w:t xml:space="preserve">[Konkreter Punkt 1 / 2 / 3]</w:t>
+      </w:r>
+      <w:r>
+        <w:rPr>
+          <w:b w:val="false"/>
+          <w:bCs w:val="false"/>
+          <w:i w:val="false"/>
+          <w:iCs w:val="false"/>
+        </w:rPr>
+        <w:t xml:space="preserve">: echte, individuelle Beobachtungen zur Website oder Präsenz dieses Kunden, keine Standardfloskeln.</w:t>
       </w:r>
     </w:p>
     <w:p>
@@ -530,70 +655,16 @@
           <w:i w:val="false"/>
           <w:iCs w:val="false"/>
         </w:rPr>
-        <w:t xml:space="preserve">[Vorname]</w:t>
-      </w:r>
-      <w:r>
-        <w:rPr>
-          <w:b w:val="false"/>
-          <w:bCs w:val="false"/>
-          <w:i w:val="false"/>
-          <w:iCs w:val="false"/>
-        </w:rPr>
-        <w:t xml:space="preserve">: Vorname des Kunden, siehe Du-Regelung in den Telefonskripten.</w:t>
-      </w:r>
-    </w:p>
-    <w:p>
-      <w:pPr>
-        <w:spacing w:after="120"/>
-        <w:ind w:left="360"/>
-      </w:pPr>
-      <w:r>
-        <w:t xml:space="preserve">• </w:t>
-      </w:r>
-      <w:r>
-        <w:rPr>
-          <w:b/>
-          <w:bCs/>
-          <w:i w:val="false"/>
-          <w:iCs w:val="false"/>
-        </w:rPr>
-        <w:t xml:space="preserve">[Konkreter Punkt 1 / 2 / 3]</w:t>
-      </w:r>
-      <w:r>
-        <w:rPr>
-          <w:b w:val="false"/>
-          <w:bCs w:val="false"/>
-          <w:i w:val="false"/>
-          <w:iCs w:val="false"/>
-        </w:rPr>
-        <w:t xml:space="preserve">: echte, individuelle Beobachtungen zur Website oder Präsenz dieses Kunden, keine Standardfloskeln.</w:t>
-      </w:r>
-    </w:p>
-    <w:p>
-      <w:pPr>
-        <w:spacing w:after="120"/>
-        <w:ind w:left="360"/>
-      </w:pPr>
-      <w:r>
-        <w:t xml:space="preserve">• </w:t>
-      </w:r>
-      <w:r>
-        <w:rPr>
-          <w:b/>
-          <w:bCs/>
-          <w:i w:val="false"/>
-          <w:iCs w:val="false"/>
-        </w:rPr>
-        <w:t xml:space="preserve">[Firma]</w:t>
-      </w:r>
-      <w:r>
-        <w:rPr>
-          <w:b w:val="false"/>
-          <w:bCs w:val="false"/>
-          <w:i w:val="false"/>
-          <w:iCs w:val="false"/>
-        </w:rPr>
-        <w:t xml:space="preserve">: Name des Unternehmens des Kunden.</w:t>
+        <w:t xml:space="preserve">[Was das Unternehmen unverwechselbar und unwiderstehlich relevant macht]</w:t>
+      </w:r>
+      <w:r>
+        <w:rPr>
+          <w:b w:val="false"/>
+          <w:bCs w:val="false"/>
+          <w:i w:val="false"/>
+          <w:iCs w:val="false"/>
+        </w:rPr>
+        <w:t xml:space="preserve">: der echte Unterschied dieses Kunden, meist aus Call 2 bekannt, zum Beispiel Erfahrung, Haltung oder Arbeitsweise.</w:t>
       </w:r>
     </w:p>
     <w:sectPr>

</xml_diff>

<commit_message>
Soften opening line of the no-interest follow-up email
Der erste Satz wirkte vorwurfsvoll. Ersetzt durch eine wertschaetzende
Eroeffnung, die zuerst die Substanz des Kunden anerkennt und die
Sichtbarkeitsluecke als Chance statt als Fehler rahmt, passend zur
Rolle als vertrauensvoller Berater statt Kritiker.

Co-Authored-By: Claude Sonnet 5 <noreply@anthropic.com>
Claude-Session: https://claude.ai/code/session_01DeqSdBatYE6t9FA6GS9TPf
</commit_message>
<xml_diff>
--- a/vertrieb/Recognize-You-Email-nach-Absage.docx
+++ b/vertrieb/Recognize-You-Email-nach-Absage.docx
@@ -150,7 +150,7 @@
           <w:i w:val="false"/>
           <w:iCs w:val="false"/>
         </w:rPr>
-        <w:t xml:space="preserve">Aktuell wird </w:t>
+        <w:t xml:space="preserve">Was mir aus unserem Gespräch am meisten im Kopf geblieben ist: Wie viel Substanz in </w:t>
       </w:r>
       <w:r>
         <w:rPr>
@@ -168,7 +168,7 @@
           <w:i w:val="false"/>
           <w:iCs w:val="false"/>
         </w:rPr>
-        <w:t xml:space="preserve"> online nicht annähernd so gesehen, wie es sich in Wahrheit am Markt behauptet. Mir ist zum Beispiel aufgefallen, dass </w:t>
+        <w:t xml:space="preserve"> steckt, die online aktuell noch gar nicht so zur Geltung kommt, wie sie es verdient hätte. Mir ist zum Beispiel aufgefallen, dass </w:t>
       </w:r>
       <w:r>
         <w:rPr>
@@ -186,7 +186,7 @@
           <w:i w:val="false"/>
           <w:iCs w:val="false"/>
         </w:rPr>
-        <w:t xml:space="preserve">. Dazu kommt, dass </w:t>
+        <w:t xml:space="preserve">. Dazu kommt </w:t>
       </w:r>
       <w:r>
         <w:rPr>
@@ -222,7 +222,7 @@
           <w:i w:val="false"/>
           <w:iCs w:val="false"/>
         </w:rPr>
-        <w:t xml:space="preserve">. Das hat nichts mit der Qualität Deiner Arbeit zu tun, sondern nur damit, wie diese Qualität aktuell nach außen sichtbar wird, oder eben nicht.</w:t>
+        <w:t xml:space="preserve">. Das sagt nichts über die Qualität Deiner Arbeit aus, die ist längst da, sie wird online nur noch nicht in vollem Maß gezeigt.</w:t>
       </w:r>
     </w:p>
     <w:p>

</xml_diff>

<commit_message>
Save copywriting strategy and apply it to the follow-up email
Neues Referenzdokument copywriting-strategie.md (Quelle: Kevins
Copywriting-Dokument, Input Nikolaos Chronz) mit den generellen
Prinzipien und dem Aufbau fuer Werbeanzeigen-Copy, plus Referenzbild.
Verlinkt aus brand-basis.md fuer alle kuenftige Texterstellung.

In der Nachfass-Mail direkt angewendet: Kredibilitaetssatz ergaenzt,
dezente Dringlichkeit bei den Fakten, und ein fehlender klarer
naechster Schritt (Wo bekommt man das) vor der Signatur ergaenzt.

Co-Authored-By: Claude Sonnet 5 <noreply@anthropic.com>
Claude-Session: https://claude.ai/code/session_01DeqSdBatYE6t9FA6GS9TPf
</commit_message>
<xml_diff>
--- a/vertrieb/Recognize-You-Email-nach-Absage.docx
+++ b/vertrieb/Recognize-You-Email-nach-Absage.docx
@@ -236,7 +236,25 @@
           <w:i w:val="false"/>
           <w:iCs w:val="false"/>
         </w:rPr>
-        <w:t xml:space="preserve">Bei den meisten Unternehmen entstehen Website, Social Media und Anzeigen getrennt voneinander, mal selbst gemacht, mal von unterschiedlichen Dienstleistern, ohne dass am Ende ein stimmiges Bild entsteht. Bei einer Marke, die wirklich funktioniert, ist das anders: Dort ist jeder Klick, jede Seite und jede Anzeige exakt auf das abgestimmt, was Deine eigene Stammkundschaft wirklich braucht. Genau dieser ganzheitliche Blick fehlt den meisten, die sich mit einzelnen Maßnahmen begnügen, und das ist der eigentliche Grund, warum dieser Bereich so oft liegen bleibt.</w:t>
+        <w:t xml:space="preserve">Das sage ich nicht einfach so: Ich beschäftige mich seit Jahren genau damit, wie Unternehmen wie </w:t>
+      </w:r>
+      <w:r>
+        <w:rPr>
+          <w:b/>
+          <w:bCs/>
+          <w:i w:val="false"/>
+          <w:iCs w:val="false"/>
+        </w:rPr>
+        <w:t xml:space="preserve">[Firma]</w:t>
+      </w:r>
+      <w:r>
+        <w:rPr>
+          <w:b w:val="false"/>
+          <w:bCs w:val="false"/>
+          <w:i w:val="false"/>
+          <w:iCs w:val="false"/>
+        </w:rPr>
+        <w:t xml:space="preserve"> online ankommen, und sehe dieses Muster ständig. Bei den meisten Unternehmen entstehen Website, Social Media und Anzeigen getrennt voneinander, mal selbst gemacht, mal von unterschiedlichen Dienstleistern, ohne dass am Ende ein stimmiges Bild entsteht. Bei einer Marke, die wirklich funktioniert, ist das anders: Dort ist jeder Klick, jede Seite und jede Anzeige exakt auf das abgestimmt, was Deine eigene Stammkundschaft wirklich braucht. Genau dieser ganzheitliche Blick fehlt den meisten, die sich mit einzelnen Maßnahmen begnügen, und das ist der eigentliche Grund, warum dieser Bereich so oft liegen bleibt.</w:t>
       </w:r>
     </w:p>
     <w:p>
@@ -336,7 +354,7 @@
           <w:i w:val="false"/>
           <w:iCs w:val="false"/>
         </w:rPr>
-        <w:t xml:space="preserve">Rund 80 Prozent der Geschäftskunden informieren sich heute online über ein Unternehmen, bevor sie überhaupt zum Telefon greifen. Wer online überzeugt, wird angerufen, wer nicht überzeugt, erfährt es nie.</w:t>
+        <w:t xml:space="preserve">Rund 80 Prozent der Geschäftskunden informieren sich heute online über ein Unternehmen, bevor sie überhaupt zum Telefon greifen. Wer online überzeugt, wird angerufen, wer nicht überzeugt, erfährt es nie, und genau deshalb lohnt es sich, das jetzt in die Hand zu nehmen.</w:t>
       </w:r>
     </w:p>
     <w:p>
@@ -396,6 +414,38 @@
           <w:iCs w:val="false"/>
         </w:rPr>
         <w:t xml:space="preserve"> zu dem, was es ist. Genau das geht in der aktuellen Darstellung unter. Ein richtiger, ganzheitlicher Auftritt macht das nicht länger nur intern sichtbar, sondern für jeden auf den ersten Blick unmissverständlich klar.</w:t>
+      </w:r>
+    </w:p>
+    <w:p>
+      <w:pPr>
+        <w:spacing w:after="200"/>
+      </w:pPr>
+      <w:r>
+        <w:rPr>
+          <w:b w:val="false"/>
+          <w:bCs w:val="false"/>
+          <w:i w:val="false"/>
+          <w:iCs w:val="false"/>
+        </w:rPr>
+        <w:t xml:space="preserve">Wenn Du magst, schreib mir einfach kurz zurück oder ruf durch, dann schauen wir uns gemeinsam an, wo bei </w:t>
+      </w:r>
+      <w:r>
+        <w:rPr>
+          <w:b/>
+          <w:bCs/>
+          <w:i w:val="false"/>
+          <w:iCs w:val="false"/>
+        </w:rPr>
+        <w:t xml:space="preserve">[Firma]</w:t>
+      </w:r>
+      <w:r>
+        <w:rPr>
+          <w:b w:val="false"/>
+          <w:bCs w:val="false"/>
+          <w:i w:val="false"/>
+          <w:iCs w:val="false"/>
+        </w:rPr>
+        <w:t xml:space="preserve"> der größte Hebel liegt.</w:t>
       </w:r>
     </w:p>
     <w:p>

</xml_diff>

<commit_message>
Remove cliche opener and add no-stock-phrase rule
"Das sage ich nicht einfach so" durch eine direkte, konkrete Aussage
ersetzt (sechs Jahre Erfahrung direkt ins Muster eingebaut statt als
Vorspann). Neue Regel in copywriting-strategie.md aufgenommen: keine
Standardfloskeln, Aussagen direkt und konkret machen, gilt fuer alle
kuenftige Texterstellung.

Co-Authored-By: Claude Sonnet 5 <noreply@anthropic.com>
Claude-Session: https://claude.ai/code/session_01DeqSdBatYE6t9FA6GS9TPf
</commit_message>
<xml_diff>
--- a/vertrieb/Recognize-You-Email-nach-Absage.docx
+++ b/vertrieb/Recognize-You-Email-nach-Absage.docx
@@ -236,7 +236,7 @@
           <w:i w:val="false"/>
           <w:iCs w:val="false"/>
         </w:rPr>
-        <w:t xml:space="preserve">Das sage ich nicht einfach so: Ich beschäftige mich seit Jahren genau damit, wie Unternehmen wie </w:t>
+        <w:t xml:space="preserve">Seit sechs Jahren sehe ich bei Unternehmen wie </w:t>
       </w:r>
       <w:r>
         <w:rPr>
@@ -254,7 +254,7 @@
           <w:i w:val="false"/>
           <w:iCs w:val="false"/>
         </w:rPr>
-        <w:t xml:space="preserve"> online ankommen, und sehe dieses Muster ständig. Bei den meisten Unternehmen entstehen Website, Social Media und Anzeigen getrennt voneinander, mal selbst gemacht, mal von unterschiedlichen Dienstleistern, ohne dass am Ende ein stimmiges Bild entsteht. Bei einer Marke, die wirklich funktioniert, ist das anders: Dort ist jeder Klick, jede Seite und jede Anzeige exakt auf das abgestimmt, was Deine eigene Stammkundschaft wirklich braucht. Genau dieser ganzheitliche Blick fehlt den meisten, die sich mit einzelnen Maßnahmen begnügen, und das ist der eigentliche Grund, warum dieser Bereich so oft liegen bleibt.</w:t>
+        <w:t xml:space="preserve"> immer wieder dasselbe Muster: Website, Social Media und Anzeigen entstehen getrennt voneinander, mal selbst gemacht, mal von unterschiedlichen Dienstleistern, ohne dass am Ende ein stimmiges Bild entsteht. Bei einer Marke, die wirklich funktioniert, ist das anders: Dort ist jeder Klick, jede Seite und jede Anzeige exakt auf das abgestimmt, was Deine eigene Stammkundschaft wirklich braucht. Genau dieser ganzheitliche Blick fehlt den meisten, die sich mit einzelnen Maßnahmen begnügen, und das ist der eigentliche Grund, warum dieser Bereich so oft liegen bleibt.</w:t>
       </w:r>
     </w:p>
     <w:p>

</xml_diff>

<commit_message>
Write warm sales texts in an already-a-customer tone
Kevins Kernpunkt: Vertriebstexte an Leads mit bestehendem Kontakt
sollen klingen, als wäre der Leser bereits Kunde, ohne Beweisfuehrung
der eigenen Erfahrung. "Seit sechs Jahren sehe ich..." fiel darunter
genauso wie die vorherige Floskel und ist raus. Dauerhaft als
Grundprinzip in copywriting-strategie.md festgehalten, inklusive
Abgrenzung zur "Kredibilitaet aufbauen"-Stufe, die nur fuer kalte
Anzeigen an Fremde gilt.

Co-Authored-By: Claude Sonnet 5 <noreply@anthropic.com>
Claude-Session: https://claude.ai/code/session_01DeqSdBatYE6t9FA6GS9TPf
</commit_message>
<xml_diff>
--- a/vertrieb/Recognize-You-Email-nach-Absage.docx
+++ b/vertrieb/Recognize-You-Email-nach-Absage.docx
@@ -236,25 +236,7 @@
           <w:i w:val="false"/>
           <w:iCs w:val="false"/>
         </w:rPr>
-        <w:t xml:space="preserve">Seit sechs Jahren sehe ich bei Unternehmen wie </w:t>
-      </w:r>
-      <w:r>
-        <w:rPr>
-          <w:b/>
-          <w:bCs/>
-          <w:i w:val="false"/>
-          <w:iCs w:val="false"/>
-        </w:rPr>
-        <w:t xml:space="preserve">[Firma]</w:t>
-      </w:r>
-      <w:r>
-        <w:rPr>
-          <w:b w:val="false"/>
-          <w:bCs w:val="false"/>
-          <w:i w:val="false"/>
-          <w:iCs w:val="false"/>
-        </w:rPr>
-        <w:t xml:space="preserve"> immer wieder dasselbe Muster: Website, Social Media und Anzeigen entstehen getrennt voneinander, mal selbst gemacht, mal von unterschiedlichen Dienstleistern, ohne dass am Ende ein stimmiges Bild entsteht. Bei einer Marke, die wirklich funktioniert, ist das anders: Dort ist jeder Klick, jede Seite und jede Anzeige exakt auf das abgestimmt, was Deine eigene Stammkundschaft wirklich braucht. Genau dieser ganzheitliche Blick fehlt den meisten, die sich mit einzelnen Maßnahmen begnügen, und das ist der eigentliche Grund, warum dieser Bereich so oft liegen bleibt.</w:t>
+        <w:t xml:space="preserve">Bei den meisten Unternehmen entstehen Website, Social Media und Anzeigen getrennt voneinander, mal selbst gemacht, mal von unterschiedlichen Dienstleistern, ohne dass am Ende ein stimmiges Bild entsteht. Bei einer Marke, die wirklich funktioniert, ist das anders: Dort ist jeder Klick, jede Seite und jede Anzeige exakt auf das abgestimmt, was Deine eigene Stammkundschaft wirklich braucht. Genau dieser ganzheitliche Blick fehlt den meisten, die sich mit einzelnen Maßnahmen begnügen, und das ist der eigentliche Grund, warum dieser Bereich so oft liegen bleibt.</w:t>
       </w:r>
     </w:p>
     <w:p>

</xml_diff>